<commit_message>
Peers are physical and count from 1; the layers count from 0, the semantic origin
The owner's ruling of 12 September 2026 closes the open call on the peering
enumeration. The Harmonization Record row moves from "Reported, not resolved"
to "Resolved"; one clarification under "First is always 0" states the rule;
the peering sheet says the same where it reported the difference; the
owner's words stand on the definition they extend, FIRST_IS_ALWAYS_0.md, and
in the specification's history; the field guide teaches it in section 3 and
no longer lists it as open; the generated .docx is patched to the same text
and read back. Record: section 16.

Co-Authored-By: Claude Fable 5.1 <noreply@anthropic.com>
Claude-Session: https://claude.ai/code/session_012ytXhA64AqfaUdgLeN3Gqe
</commit_message>
<xml_diff>
--- a/L8/L4/work/writing/7lm-harmonized-architecture-specification.docx
+++ b/L8/L4/work/writing/7lm-harmonized-architecture-specification.docx
@@ -357,6 +357,17 @@
       </w:r>
       <w:r>
         <w:t xml:space="preserve"> Ordinals are semantics; numbers are magnitudes; the relation between them is "is". The seven interior layers are the seven semantics FIRST through SEVENTH and the seven magnitudes L0 through L6, so the seventh layer is L6: layer 7 will always be layer 6. L7 is a magnitude, the position numbered 7, the eighth reached in traversal: numbered, not a layer. L8 is a count, not a position: the interior's own zero over the seven layer zeros. Nothing follows the desk in traversal; past the face the count begins again at zero, in another object's tree, where this whole object is one bound object at a peer position.</w:t>
+      </w:r>
+    </w:p>
+    <w:p>
+      <w:r>
+        <w:rPr>
+          <w:b/>
+        </w:rPr>
+        <w:t>[Clarification]</w:t>
+      </w:r>
+      <w:r>
+        <w:t xml:space="preserve"> Peers are physical and are counted from 1 at L7/peering/: peer-1, object-1. The layers are counted from 0: 0 is the semantic origin, where the Semantic and Epistemic rails define the layers above; it is what exists first, before anything physical. The two counts do not conflict.</w:t>
       </w:r>
     </w:p>
     <w:p>
@@ -9508,7 +9519,7 @@
           </w:tcPr>
           <w:p>
             <w:r>
-              <w:t>The peering enumeration begins at 1 while the layers count from 0 under "First is always 0"; the owner's call.</w:t>
+              <w:t>Peers are physical and are counted from 1; the layers are counted from 0, the semantic origin, where the Semantic and Epistemic rails define the layers above. The owner's ruling of 12 September 2026; the words are at L8/L6/history/specification-history.md.</w:t>
             </w:r>
           </w:p>
         </w:tc>

</xml_diff>